<commit_message>
Epic 1 - Artem Mnikh
</commit_message>
<xml_diff>
--- a/ai_14/artem_mnikh/epic_1/epic_1_report_artem_mnikh.docx
+++ b/ai_14/artem_mnikh/epic_1/epic_1_report_artem_mnikh.docx
@@ -106,12 +106,12 @@
             <wp:extent cx="2727722" cy="2571750"/>
             <wp:effectExtent b="0" l="0" r="0" t="0"/>
             <wp:wrapNone/>
-            <wp:docPr descr="A blue and white logo&#10;&#10;Description automatically generated" id="16" name="image14.jpg"/>
+            <wp:docPr descr="A blue and white logo&#10;&#10;Description automatically generated" id="16" name="image4.jpg"/>
             <a:graphic>
               <a:graphicData uri="http://schemas.openxmlformats.org/drawingml/2006/picture">
                 <pic:pic>
                   <pic:nvPicPr>
-                    <pic:cNvPr descr="A blue and white logo&#10;&#10;Description automatically generated" id="0" name="image14.jpg"/>
+                    <pic:cNvPr descr="A blue and white logo&#10;&#10;Description automatically generated" id="0" name="image4.jpg"/>
                     <pic:cNvPicPr preferRelativeResize="0"/>
                   </pic:nvPicPr>
                   <pic:blipFill>
@@ -4749,7 +4749,7 @@
     <w:sdt>
       <w:sdtPr>
         <w:lock w:val="contentLocked"/>
-        <w:id w:val="-512965516"/>
+        <w:id w:val="1467822633"/>
         <w:tag w:val="goog_rdk_0"/>
       </w:sdtPr>
       <w:sdtContent>
@@ -4818,12 +4818,12 @@
                     <wp:inline distB="114300" distT="114300" distL="114300" distR="114300">
                       <wp:extent cx="4459103" cy="8590597"/>
                       <wp:effectExtent b="0" l="0" r="0" t="0"/>
-                      <wp:docPr id="6" name="image6.png"/>
+                      <wp:docPr id="6" name="image10.png"/>
                       <a:graphic>
                         <a:graphicData uri="http://schemas.openxmlformats.org/drawingml/2006/picture">
                           <pic:pic>
                             <pic:nvPicPr>
-                              <pic:cNvPr id="0" name="image6.png"/>
+                              <pic:cNvPr id="0" name="image10.png"/>
                               <pic:cNvPicPr preferRelativeResize="0"/>
                             </pic:nvPicPr>
                             <pic:blipFill>
@@ -4952,7 +4952,7 @@
     <w:sdt>
       <w:sdtPr>
         <w:lock w:val="contentLocked"/>
-        <w:id w:val="563170868"/>
+        <w:id w:val="-1215111738"/>
         <w:tag w:val="goog_rdk_1"/>
       </w:sdtPr>
       <w:sdtContent>
@@ -5021,12 +5021,12 @@
                     <wp:inline distB="114300" distT="114300" distL="114300" distR="114300">
                       <wp:extent cx="5637848" cy="8125912"/>
                       <wp:effectExtent b="0" l="0" r="0" t="0"/>
-                      <wp:docPr id="27" name="image23.png"/>
+                      <wp:docPr id="27" name="image26.png"/>
                       <a:graphic>
                         <a:graphicData uri="http://schemas.openxmlformats.org/drawingml/2006/picture">
                           <pic:pic>
                             <pic:nvPicPr>
-                              <pic:cNvPr id="0" name="image23.png"/>
+                              <pic:cNvPr id="0" name="image26.png"/>
                               <pic:cNvPicPr preferRelativeResize="0"/>
                             </pic:nvPicPr>
                             <pic:blipFill>
@@ -5256,7 +5256,7 @@
     <w:sdt>
       <w:sdtPr>
         <w:lock w:val="contentLocked"/>
-        <w:id w:val="-1109853610"/>
+        <w:id w:val="1278112364"/>
         <w:tag w:val="goog_rdk_2"/>
       </w:sdtPr>
       <w:sdtContent>
@@ -5325,12 +5325,12 @@
                     <wp:inline distB="114300" distT="114300" distL="114300" distR="114300">
                       <wp:extent cx="6162675" cy="2844800"/>
                       <wp:effectExtent b="0" l="0" r="0" t="0"/>
-                      <wp:docPr id="13" name="image9.png"/>
+                      <wp:docPr id="13" name="image3.png"/>
                       <a:graphic>
                         <a:graphicData uri="http://schemas.openxmlformats.org/drawingml/2006/picture">
                           <pic:pic>
                             <pic:nvPicPr>
-                              <pic:cNvPr id="0" name="image9.png"/>
+                              <pic:cNvPr id="0" name="image3.png"/>
                               <pic:cNvPicPr preferRelativeResize="0"/>
                             </pic:nvPicPr>
                             <pic:blipFill>
@@ -5496,7 +5496,7 @@
     <w:sdt>
       <w:sdtPr>
         <w:lock w:val="contentLocked"/>
-        <w:id w:val="516144410"/>
+        <w:id w:val="-1270858382"/>
         <w:tag w:val="goog_rdk_3"/>
       </w:sdtPr>
       <w:sdtContent>
@@ -5566,12 +5566,12 @@
                     <wp:inline distB="114300" distT="114300" distL="114300" distR="114300">
                       <wp:extent cx="5705475" cy="2717800"/>
                       <wp:effectExtent b="0" l="0" r="0" t="0"/>
-                      <wp:docPr id="8" name="image11.png"/>
+                      <wp:docPr id="8" name="image17.png"/>
                       <a:graphic>
                         <a:graphicData uri="http://schemas.openxmlformats.org/drawingml/2006/picture">
                           <pic:pic>
                             <pic:nvPicPr>
-                              <pic:cNvPr id="0" name="image11.png"/>
+                              <pic:cNvPr id="0" name="image17.png"/>
                               <pic:cNvPicPr preferRelativeResize="0"/>
                             </pic:nvPicPr>
                             <pic:blipFill>
@@ -5728,7 +5728,7 @@
     <w:sdt>
       <w:sdtPr>
         <w:lock w:val="contentLocked"/>
-        <w:id w:val="494402635"/>
+        <w:id w:val="-1802552526"/>
         <w:tag w:val="goog_rdk_4"/>
       </w:sdtPr>
       <w:sdtContent>
@@ -5798,12 +5798,12 @@
                     <wp:inline distB="114300" distT="114300" distL="114300" distR="114300">
                       <wp:extent cx="5705475" cy="2705100"/>
                       <wp:effectExtent b="0" l="0" r="0" t="0"/>
-                      <wp:docPr id="7" name="image4.png"/>
+                      <wp:docPr id="7" name="image11.png"/>
                       <a:graphic>
                         <a:graphicData uri="http://schemas.openxmlformats.org/drawingml/2006/picture">
                           <pic:pic>
                             <pic:nvPicPr>
-                              <pic:cNvPr id="0" name="image4.png"/>
+                              <pic:cNvPr id="0" name="image11.png"/>
                               <pic:cNvPicPr preferRelativeResize="0"/>
                             </pic:nvPicPr>
                             <pic:blipFill>
@@ -5945,7 +5945,7 @@
     <w:sdt>
       <w:sdtPr>
         <w:lock w:val="contentLocked"/>
-        <w:id w:val="1764349928"/>
+        <w:id w:val="1057357516"/>
         <w:tag w:val="goog_rdk_5"/>
       </w:sdtPr>
       <w:sdtContent>
@@ -6015,12 +6015,12 @@
                     <wp:inline distB="114300" distT="114300" distL="114300" distR="114300">
                       <wp:extent cx="5705475" cy="2857500"/>
                       <wp:effectExtent b="0" l="0" r="0" t="0"/>
-                      <wp:docPr id="9" name="image2.png"/>
+                      <wp:docPr id="9" name="image9.png"/>
                       <a:graphic>
                         <a:graphicData uri="http://schemas.openxmlformats.org/drawingml/2006/picture">
                           <pic:pic>
                             <pic:nvPicPr>
-                              <pic:cNvPr id="0" name="image2.png"/>
+                              <pic:cNvPr id="0" name="image9.png"/>
                               <pic:cNvPicPr preferRelativeResize="0"/>
                             </pic:nvPicPr>
                             <pic:blipFill>
@@ -6173,7 +6173,7 @@
     <w:sdt>
       <w:sdtPr>
         <w:lock w:val="contentLocked"/>
-        <w:id w:val="1199657833"/>
+        <w:id w:val="65864589"/>
         <w:tag w:val="goog_rdk_6"/>
       </w:sdtPr>
       <w:sdtContent>
@@ -6243,12 +6243,12 @@
                     <wp:inline distB="114300" distT="114300" distL="114300" distR="114300">
                       <wp:extent cx="5705475" cy="1168400"/>
                       <wp:effectExtent b="0" l="0" r="0" t="0"/>
-                      <wp:docPr id="24" name="image17.png"/>
+                      <wp:docPr id="24" name="image25.png"/>
                       <a:graphic>
                         <a:graphicData uri="http://schemas.openxmlformats.org/drawingml/2006/picture">
                           <pic:pic>
                             <pic:nvPicPr>
-                              <pic:cNvPr id="0" name="image17.png"/>
+                              <pic:cNvPr id="0" name="image25.png"/>
                               <pic:cNvPicPr preferRelativeResize="0"/>
                             </pic:nvPicPr>
                             <pic:blipFill>
@@ -6399,7 +6399,7 @@
     <w:sdt>
       <w:sdtPr>
         <w:lock w:val="contentLocked"/>
-        <w:id w:val="1713639799"/>
+        <w:id w:val="-1158519201"/>
         <w:tag w:val="goog_rdk_7"/>
       </w:sdtPr>
       <w:sdtContent>
@@ -6468,12 +6468,12 @@
                     <wp:inline distB="114300" distT="114300" distL="114300" distR="114300">
                       <wp:extent cx="6162675" cy="2527300"/>
                       <wp:effectExtent b="0" l="0" r="0" t="0"/>
-                      <wp:docPr id="26" name="image24.png"/>
+                      <wp:docPr id="26" name="image22.png"/>
                       <a:graphic>
                         <a:graphicData uri="http://schemas.openxmlformats.org/drawingml/2006/picture">
                           <pic:pic>
                             <pic:nvPicPr>
-                              <pic:cNvPr id="0" name="image24.png"/>
+                              <pic:cNvPr id="0" name="image22.png"/>
                               <pic:cNvPicPr preferRelativeResize="0"/>
                             </pic:nvPicPr>
                             <pic:blipFill>
@@ -6665,7 +6665,7 @@
     <w:sdt>
       <w:sdtPr>
         <w:lock w:val="contentLocked"/>
-        <w:id w:val="-1536270848"/>
+        <w:id w:val="-200991203"/>
         <w:tag w:val="goog_rdk_8"/>
       </w:sdtPr>
       <w:sdtContent>
@@ -6735,12 +6735,12 @@
                     <wp:inline distB="114300" distT="114300" distL="114300" distR="114300">
                       <wp:extent cx="5705475" cy="2527300"/>
                       <wp:effectExtent b="0" l="0" r="0" t="0"/>
-                      <wp:docPr id="17" name="image10.png"/>
+                      <wp:docPr id="17" name="image5.png"/>
                       <a:graphic>
                         <a:graphicData uri="http://schemas.openxmlformats.org/drawingml/2006/picture">
                           <pic:pic>
                             <pic:nvPicPr>
-                              <pic:cNvPr id="0" name="image10.png"/>
+                              <pic:cNvPr id="0" name="image5.png"/>
                               <pic:cNvPicPr preferRelativeResize="0"/>
                             </pic:nvPicPr>
                             <pic:blipFill>
@@ -6851,7 +6851,7 @@
     <w:sdt>
       <w:sdtPr>
         <w:lock w:val="contentLocked"/>
-        <w:id w:val="161179754"/>
+        <w:id w:val="371147887"/>
         <w:tag w:val="goog_rdk_9"/>
       </w:sdtPr>
       <w:sdtContent>
@@ -7207,7 +7207,7 @@
     <w:sdt>
       <w:sdtPr>
         <w:lock w:val="contentLocked"/>
-        <w:id w:val="-954138390"/>
+        <w:id w:val="-1339190226"/>
         <w:tag w:val="goog_rdk_10"/>
       </w:sdtPr>
       <w:sdtContent>
@@ -7277,12 +7277,12 @@
                     <wp:inline distB="114300" distT="114300" distL="114300" distR="114300">
                       <wp:extent cx="5705475" cy="1778000"/>
                       <wp:effectExtent b="0" l="0" r="0" t="0"/>
-                      <wp:docPr id="14" name="image7.png"/>
+                      <wp:docPr id="14" name="image2.png"/>
                       <a:graphic>
                         <a:graphicData uri="http://schemas.openxmlformats.org/drawingml/2006/picture">
                           <pic:pic>
                             <pic:nvPicPr>
-                              <pic:cNvPr id="0" name="image7.png"/>
+                              <pic:cNvPr id="0" name="image2.png"/>
                               <pic:cNvPicPr preferRelativeResize="0"/>
                             </pic:nvPicPr>
                             <pic:blipFill>
@@ -7496,7 +7496,7 @@
     <w:sdt>
       <w:sdtPr>
         <w:lock w:val="contentLocked"/>
-        <w:id w:val="1699998717"/>
+        <w:id w:val="1199698936"/>
         <w:tag w:val="goog_rdk_11"/>
       </w:sdtPr>
       <w:sdtContent>
@@ -7566,12 +7566,12 @@
                     <wp:inline distB="114300" distT="114300" distL="114300" distR="114300">
                       <wp:extent cx="5705475" cy="3657600"/>
                       <wp:effectExtent b="0" l="0" r="0" t="0"/>
-                      <wp:docPr id="23" name="image25.png"/>
+                      <wp:docPr id="23" name="image19.png"/>
                       <a:graphic>
                         <a:graphicData uri="http://schemas.openxmlformats.org/drawingml/2006/picture">
                           <pic:pic>
                             <pic:nvPicPr>
-                              <pic:cNvPr id="0" name="image25.png"/>
+                              <pic:cNvPr id="0" name="image19.png"/>
                               <pic:cNvPicPr preferRelativeResize="0"/>
                             </pic:nvPicPr>
                             <pic:blipFill>
@@ -7682,7 +7682,7 @@
     <w:sdt>
       <w:sdtPr>
         <w:lock w:val="contentLocked"/>
-        <w:id w:val="1718551927"/>
+        <w:id w:val="1023552461"/>
         <w:tag w:val="goog_rdk_12"/>
       </w:sdtPr>
       <w:sdtContent>
@@ -7752,12 +7752,12 @@
                     <wp:inline distB="114300" distT="114300" distL="114300" distR="114300">
                       <wp:extent cx="5705475" cy="2438400"/>
                       <wp:effectExtent b="0" l="0" r="0" t="0"/>
-                      <wp:docPr id="4" name="image3.png"/>
+                      <wp:docPr id="4" name="image16.png"/>
                       <a:graphic>
                         <a:graphicData uri="http://schemas.openxmlformats.org/drawingml/2006/picture">
                           <pic:pic>
                             <pic:nvPicPr>
-                              <pic:cNvPr id="0" name="image3.png"/>
+                              <pic:cNvPr id="0" name="image16.png"/>
                               <pic:cNvPicPr preferRelativeResize="0"/>
                             </pic:nvPicPr>
                             <pic:blipFill>
@@ -7937,7 +7937,7 @@
     <w:sdt>
       <w:sdtPr>
         <w:lock w:val="contentLocked"/>
-        <w:id w:val="-130417391"/>
+        <w:id w:val="-2136212385"/>
         <w:tag w:val="goog_rdk_13"/>
       </w:sdtPr>
       <w:sdtContent>
@@ -8006,12 +8006,12 @@
                     <wp:inline distB="114300" distT="114300" distL="114300" distR="114300">
                       <wp:extent cx="5988750" cy="8057197"/>
                       <wp:effectExtent b="0" l="0" r="0" t="0"/>
-                      <wp:docPr id="15" name="image12.png"/>
+                      <wp:docPr id="15" name="image15.png"/>
                       <a:graphic>
                         <a:graphicData uri="http://schemas.openxmlformats.org/drawingml/2006/picture">
                           <pic:pic>
                             <pic:nvPicPr>
-                              <pic:cNvPr id="0" name="image12.png"/>
+                              <pic:cNvPr id="0" name="image15.png"/>
                               <pic:cNvPicPr preferRelativeResize="0"/>
                             </pic:nvPicPr>
                             <pic:blipFill>
@@ -8105,7 +8105,7 @@
     <w:sdt>
       <w:sdtPr>
         <w:lock w:val="contentLocked"/>
-        <w:id w:val="-672557987"/>
+        <w:id w:val="-1404821089"/>
         <w:tag w:val="goog_rdk_14"/>
       </w:sdtPr>
       <w:sdtContent>
@@ -8176,12 +8176,12 @@
                     <wp:inline distB="114300" distT="114300" distL="114300" distR="114300">
                       <wp:extent cx="6215013" cy="7266622"/>
                       <wp:effectExtent b="0" l="0" r="0" t="0"/>
-                      <wp:docPr id="21" name="image18.png"/>
+                      <wp:docPr id="21" name="image14.png"/>
                       <a:graphic>
                         <a:graphicData uri="http://schemas.openxmlformats.org/drawingml/2006/picture">
                           <pic:pic>
                             <pic:nvPicPr>
-                              <pic:cNvPr id="0" name="image18.png"/>
+                              <pic:cNvPr id="0" name="image14.png"/>
                               <pic:cNvPicPr preferRelativeResize="0"/>
                             </pic:nvPicPr>
                             <pic:blipFill>
@@ -8280,7 +8280,7 @@
     <w:sdt>
       <w:sdtPr>
         <w:lock w:val="contentLocked"/>
-        <w:id w:val="277930855"/>
+        <w:id w:val="-214401145"/>
         <w:tag w:val="goog_rdk_15"/>
       </w:sdtPr>
       <w:sdtContent>
@@ -8350,12 +8350,12 @@
                     <wp:inline distB="114300" distT="114300" distL="114300" distR="114300">
                       <wp:extent cx="5810250" cy="4219575"/>
                       <wp:effectExtent b="0" l="0" r="0" t="0"/>
-                      <wp:docPr id="2" name="image13.png"/>
+                      <wp:docPr id="2" name="image6.png"/>
                       <a:graphic>
                         <a:graphicData uri="http://schemas.openxmlformats.org/drawingml/2006/picture">
                           <pic:pic>
                             <pic:nvPicPr>
-                              <pic:cNvPr id="0" name="image13.png"/>
+                              <pic:cNvPr id="0" name="image6.png"/>
                               <pic:cNvPicPr preferRelativeResize="0"/>
                             </pic:nvPicPr>
                             <pic:blipFill>
@@ -8501,7 +8501,7 @@
             <w:u w:val="single"/>
             <w:rtl w:val="0"/>
           </w:rPr>
-          <w:t xml:space="preserve">https://github.com/artificial-intelligence-department/ai_programming_playground_2026/blob/4d35adea5d5c0c9b025ea2cfa1fd0a16b9990cec/ai_14/epic_1/practice_task_1_artem_mnikh.cpp</w:t>
+          <w:t xml:space="preserve">https://github.com/artificial-intelligence-department/ai_programming_playground_2026/blob/2f99ec183245110cc24c77259d705b9978f58bdf/ai_14/artem_mnikh/epic_1/practice_task_1_artem_mnikh.cpp</w:t>
         </w:r>
       </w:hyperlink>
       <w:r>
@@ -8549,7 +8549,7 @@
     <w:sdt>
       <w:sdtPr>
         <w:lock w:val="contentLocked"/>
-        <w:id w:val="-1908701261"/>
+        <w:id w:val="-1702931808"/>
         <w:tag w:val="goog_rdk_16"/>
       </w:sdtPr>
       <w:sdtContent>
@@ -8606,12 +8606,12 @@
                     <wp:inline distB="114300" distT="114300" distL="114300" distR="114300">
                       <wp:extent cx="2766060" cy="2132370"/>
                       <wp:effectExtent b="0" l="0" r="0" t="0"/>
-                      <wp:docPr id="10" name="image1.png"/>
+                      <wp:docPr id="10" name="image13.png"/>
                       <a:graphic>
                         <a:graphicData uri="http://schemas.openxmlformats.org/drawingml/2006/picture">
                           <pic:pic>
                             <pic:nvPicPr>
-                              <pic:cNvPr id="0" name="image1.png"/>
+                              <pic:cNvPr id="0" name="image13.png"/>
                               <pic:cNvPicPr preferRelativeResize="0"/>
                             </pic:nvPicPr>
                             <pic:blipFill>
@@ -8756,7 +8756,7 @@
             <w:u w:val="single"/>
             <w:rtl w:val="0"/>
           </w:rPr>
-          <w:t xml:space="preserve">https://github.com/artificial-intelligence-department/ai_programming_playground_2026/blob/466e12b1899a8e31c6a01b2ee5715cfa4625896f/ai_14/epic_1/practice_task_1_artem_mnikh.cpp</w:t>
+          <w:t xml:space="preserve">https://github.com/artificial-intelligence-department/ai_programming_playground_2026/blob/2f99ec183245110cc24c77259d705b9978f58bdf/ai_14/artem_mnikh/epic_1/self_practice_algotester_task_1_artem_mnikh.cpp</w:t>
         </w:r>
       </w:hyperlink>
       <w:r>
@@ -8795,7 +8795,7 @@
     <w:sdt>
       <w:sdtPr>
         <w:lock w:val="contentLocked"/>
-        <w:id w:val="-1019312749"/>
+        <w:id w:val="113300358"/>
         <w:tag w:val="goog_rdk_17"/>
       </w:sdtPr>
       <w:sdtContent>
@@ -8860,12 +8860,12 @@
                     <wp:inline distB="114300" distT="114300" distL="114300" distR="114300">
                       <wp:extent cx="3343275" cy="2838450"/>
                       <wp:effectExtent b="0" l="0" r="0" t="0"/>
-                      <wp:docPr id="20" name="image19.png"/>
+                      <wp:docPr id="20" name="image12.png"/>
                       <a:graphic>
                         <a:graphicData uri="http://schemas.openxmlformats.org/drawingml/2006/picture">
                           <pic:pic>
                             <pic:nvPicPr>
-                              <pic:cNvPr id="0" name="image19.png"/>
+                              <pic:cNvPr id="0" name="image12.png"/>
                               <pic:cNvPicPr preferRelativeResize="0"/>
                             </pic:nvPicPr>
                             <pic:blipFill>
@@ -8994,7 +8994,7 @@
             <w:u w:val="single"/>
             <w:rtl w:val="0"/>
           </w:rPr>
-          <w:t xml:space="preserve">https://github.com/artificial-intelligence-department/ai_programming_playground_2026/blob/4d35adea5d5c0c9b025ea2cfa1fd0a16b9990cec/ai_14/epic_1/self_practice_algotester_task_11_artem_mnikh.cpp</w:t>
+          <w:t xml:space="preserve">https://github.com/artificial-intelligence-department/ai_programming_playground_2026/blob/2f99ec183245110cc24c77259d705b9978f58bdf/ai_14/artem_mnikh/epic_1/self_practice_algotester_task_2_artem_mnikh.cpp</w:t>
         </w:r>
       </w:hyperlink>
       <w:r>
@@ -9032,7 +9032,7 @@
     <w:sdt>
       <w:sdtPr>
         <w:lock w:val="contentLocked"/>
-        <w:id w:val="-604995675"/>
+        <w:id w:val="1945100361"/>
         <w:tag w:val="goog_rdk_18"/>
       </w:sdtPr>
       <w:sdtContent>
@@ -9097,12 +9097,12 @@
                     <wp:inline distB="114300" distT="114300" distL="114300" distR="114300">
                       <wp:extent cx="6162675" cy="2857500"/>
                       <wp:effectExtent b="0" l="0" r="0" t="0"/>
-                      <wp:docPr id="18" name="image15.png"/>
+                      <wp:docPr id="18" name="image1.png"/>
                       <a:graphic>
                         <a:graphicData uri="http://schemas.openxmlformats.org/drawingml/2006/picture">
                           <pic:pic>
                             <pic:nvPicPr>
-                              <pic:cNvPr id="0" name="image15.png"/>
+                              <pic:cNvPr id="0" name="image1.png"/>
                               <pic:cNvPicPr preferRelativeResize="0"/>
                             </pic:nvPicPr>
                             <pic:blipFill>
@@ -9240,7 +9240,7 @@
             <w:u w:val="single"/>
             <w:rtl w:val="0"/>
           </w:rPr>
-          <w:t xml:space="preserve">https://github.com/artificial-intelligence-department/ai_programming_playground_2026/blob/4d35adea5d5c0c9b025ea2cfa1fd0a16b9990cec/ai_14/epic_1/self_practice_algotester_task_21_artem_mnikh.cpp</w:t>
+          <w:t xml:space="preserve">https://github.com/artificial-intelligence-department/ai_programming_playground_2026/blob/2f99ec183245110cc24c77259d705b9978f58bdf/ai_14/artem_mnikh/epic_1/self_practice_algotester_task_3_artem_mnikh.cpp</w:t>
         </w:r>
       </w:hyperlink>
       <w:r>
@@ -9308,7 +9308,7 @@
     <w:sdt>
       <w:sdtPr>
         <w:lock w:val="contentLocked"/>
-        <w:id w:val="-1042720013"/>
+        <w:id w:val="-453709292"/>
         <w:tag w:val="goog_rdk_19"/>
       </w:sdtPr>
       <w:sdtContent>
@@ -9379,12 +9379,12 @@
                     <wp:inline distB="114300" distT="114300" distL="114300" distR="114300">
                       <wp:extent cx="2686050" cy="2647950"/>
                       <wp:effectExtent b="0" l="0" r="0" t="0"/>
-                      <wp:docPr id="25" name="image22.png"/>
+                      <wp:docPr id="25" name="image24.png"/>
                       <a:graphic>
                         <a:graphicData uri="http://schemas.openxmlformats.org/drawingml/2006/picture">
                           <pic:pic>
                             <pic:nvPicPr>
-                              <pic:cNvPr id="0" name="image22.png"/>
+                              <pic:cNvPr id="0" name="image24.png"/>
                               <pic:cNvPicPr preferRelativeResize="0"/>
                             </pic:nvPicPr>
                             <pic:blipFill>
@@ -9544,7 +9544,7 @@
     <w:sdt>
       <w:sdtPr>
         <w:lock w:val="contentLocked"/>
-        <w:id w:val="572651193"/>
+        <w:id w:val="1280283281"/>
         <w:tag w:val="goog_rdk_20"/>
       </w:sdtPr>
       <w:sdtContent>
@@ -9613,12 +9613,12 @@
                     <wp:inline distB="114300" distT="114300" distL="114300" distR="114300">
                       <wp:extent cx="6162675" cy="3175000"/>
                       <wp:effectExtent b="0" l="0" r="0" t="0"/>
-                      <wp:docPr id="22" name="image21.png"/>
+                      <wp:docPr id="22" name="image20.png"/>
                       <a:graphic>
                         <a:graphicData uri="http://schemas.openxmlformats.org/drawingml/2006/picture">
                           <pic:pic>
                             <pic:nvPicPr>
-                              <pic:cNvPr id="0" name="image21.png"/>
+                              <pic:cNvPr id="0" name="image20.png"/>
                               <pic:cNvPicPr preferRelativeResize="0"/>
                             </pic:nvPicPr>
                             <pic:blipFill>
@@ -9751,7 +9751,7 @@
     <w:sdt>
       <w:sdtPr>
         <w:lock w:val="contentLocked"/>
-        <w:id w:val="-1512379543"/>
+        <w:id w:val="-333800576"/>
         <w:tag w:val="goog_rdk_21"/>
       </w:sdtPr>
       <w:sdtContent>
@@ -9820,12 +9820,12 @@
                     <wp:inline distB="114300" distT="114300" distL="114300" distR="114300">
                       <wp:extent cx="6162675" cy="3136900"/>
                       <wp:effectExtent b="0" l="0" r="0" t="0"/>
-                      <wp:docPr id="5" name="image26.png"/>
+                      <wp:docPr id="5" name="image7.png"/>
                       <a:graphic>
                         <a:graphicData uri="http://schemas.openxmlformats.org/drawingml/2006/picture">
                           <pic:pic>
                             <pic:nvPicPr>
-                              <pic:cNvPr id="0" name="image26.png"/>
+                              <pic:cNvPr id="0" name="image7.png"/>
                               <pic:cNvPicPr preferRelativeResize="0"/>
                             </pic:nvPicPr>
                             <pic:blipFill>
@@ -9958,7 +9958,7 @@
     <w:sdt>
       <w:sdtPr>
         <w:lock w:val="contentLocked"/>
-        <w:id w:val="1889976524"/>
+        <w:id w:val="-1847429461"/>
         <w:tag w:val="goog_rdk_22"/>
       </w:sdtPr>
       <w:sdtContent>
@@ -10027,12 +10027,12 @@
                     <wp:inline distB="114300" distT="114300" distL="114300" distR="114300">
                       <wp:extent cx="6162675" cy="3213100"/>
                       <wp:effectExtent b="0" l="0" r="0" t="0"/>
-                      <wp:docPr id="12" name="image5.png"/>
+                      <wp:docPr id="12" name="image18.png"/>
                       <a:graphic>
                         <a:graphicData uri="http://schemas.openxmlformats.org/drawingml/2006/picture">
                           <pic:pic>
                             <pic:nvPicPr>
-                              <pic:cNvPr id="0" name="image5.png"/>
+                              <pic:cNvPr id="0" name="image18.png"/>
                               <pic:cNvPicPr preferRelativeResize="0"/>
                             </pic:nvPicPr>
                             <pic:blipFill>
@@ -10170,7 +10170,7 @@
     <w:sdt>
       <w:sdtPr>
         <w:lock w:val="contentLocked"/>
-        <w:id w:val="-1700106332"/>
+        <w:id w:val="-1627368206"/>
         <w:tag w:val="goog_rdk_23"/>
       </w:sdtPr>
       <w:sdtContent>
@@ -10232,12 +10232,12 @@
                     <wp:inline distB="114300" distT="114300" distL="114300" distR="114300">
                       <wp:extent cx="5705475" cy="3416300"/>
                       <wp:effectExtent b="0" l="0" r="0" t="0"/>
-                      <wp:docPr id="19" name="image20.png"/>
+                      <wp:docPr id="19" name="image23.png"/>
                       <a:graphic>
                         <a:graphicData uri="http://schemas.openxmlformats.org/drawingml/2006/picture">
                           <pic:pic>
                             <pic:nvPicPr>
-                              <pic:cNvPr id="0" name="image20.png"/>
+                              <pic:cNvPr id="0" name="image23.png"/>
                               <pic:cNvPicPr preferRelativeResize="0"/>
                             </pic:nvPicPr>
                             <pic:blipFill>
@@ -10392,12 +10392,12 @@
                     <wp:inline distB="114300" distT="114300" distL="114300" distR="114300">
                       <wp:extent cx="3257550" cy="2943225"/>
                       <wp:effectExtent b="0" l="0" r="0" t="0"/>
-                      <wp:docPr id="3" name="image16.png"/>
+                      <wp:docPr id="3" name="image21.png"/>
                       <a:graphic>
                         <a:graphicData uri="http://schemas.openxmlformats.org/drawingml/2006/picture">
                           <pic:pic>
                             <pic:nvPicPr>
-                              <pic:cNvPr id="0" name="image16.png"/>
+                              <pic:cNvPr id="0" name="image21.png"/>
                               <pic:cNvPicPr preferRelativeResize="0"/>
                             </pic:nvPicPr>
                             <pic:blipFill>
@@ -10542,7 +10542,7 @@
     <w:sdt>
       <w:sdtPr>
         <w:lock w:val="contentLocked"/>
-        <w:id w:val="-164318588"/>
+        <w:id w:val="-1819376749"/>
         <w:tag w:val="goog_rdk_24"/>
       </w:sdtPr>
       <w:sdtContent>
@@ -10615,7 +10615,7 @@
                   </w:rPr>
                   <w:drawing>
                     <wp:inline distB="114300" distT="114300" distL="114300" distR="114300">
-                      <wp:extent cx="6162675" cy="4648200"/>
+                      <wp:extent cx="6162675" cy="2753892"/>
                       <wp:effectExtent b="0" l="0" r="0" t="0"/>
                       <wp:docPr id="11" name="image8.png"/>
                       <a:graphic>
@@ -10627,7 +10627,7 @@
                             </pic:nvPicPr>
                             <pic:blipFill>
                               <a:blip r:embed="rId47"/>
-                              <a:srcRect b="0" l="0" r="0" t="0"/>
+                              <a:srcRect b="0" l="0" r="0" t="40754"/>
                               <a:stretch>
                                 <a:fillRect/>
                               </a:stretch>
@@ -10635,7 +10635,7 @@
                             <pic:spPr>
                               <a:xfrm>
                                 <a:off x="0" y="0"/>
-                                <a:ext cx="6162675" cy="4648200"/>
+                                <a:ext cx="6162675" cy="2753892"/>
                               </a:xfrm>
                               <a:prstGeom prst="rect"/>
                               <a:ln/>
@@ -10801,8 +10801,9 @@
       </w:r>
     </w:p>
     <w:sectPr>
-      <w:footerReference r:id="rId48" w:type="default"/>
-      <w:footerReference r:id="rId49" w:type="first"/>
+      <w:headerReference r:id="rId48" w:type="default"/>
+      <w:footerReference r:id="rId49" w:type="default"/>
+      <w:footerReference r:id="rId50" w:type="first"/>
       <w:pgSz w:h="16838" w:w="11906" w:orient="portrait"/>
       <w:pgMar w:bottom="1134" w:top="1134" w:left="1134" w:right="850" w:header="708" w:footer="708"/>
       <w:pgNumType w:start="1"/>
@@ -10963,6 +10964,21 @@
     </w:r>
   </w:p>
 </w:ftr>
+</file>
+
+<file path=word/header1.xml><?xml version="1.0" encoding="utf-8"?>
+<w:hdr xmlns:mc="http://schemas.openxmlformats.org/markup-compatibility/2006" xmlns:o="urn:schemas-microsoft-com:office:office" xmlns:r="http://schemas.openxmlformats.org/officeDocument/2006/relationships" xmlns:m="http://schemas.openxmlformats.org/officeDocument/2006/math" xmlns:v="urn:schemas-microsoft-com:vml" xmlns:wp="http://schemas.openxmlformats.org/drawingml/2006/wordprocessingDrawing" xmlns:w10="urn:schemas-microsoft-com:office:word" xmlns:w="http://schemas.openxmlformats.org/wordprocessingml/2006/main" xmlns:wne="http://schemas.microsoft.com/office/word/2006/wordml" xmlns:sl="http://schemas.openxmlformats.org/schemaLibrary/2006/main" xmlns:a="http://schemas.openxmlformats.org/drawingml/2006/main" xmlns:pic="http://schemas.openxmlformats.org/drawingml/2006/picture" xmlns:c="http://schemas.openxmlformats.org/drawingml/2006/chart" xmlns:lc="http://schemas.openxmlformats.org/drawingml/2006/lockedCanvas" xmlns:dgm="http://schemas.openxmlformats.org/drawingml/2006/diagram" xmlns:wps="http://schemas.microsoft.com/office/word/2010/wordprocessingShape" xmlns:wpg="http://schemas.microsoft.com/office/word/2010/wordprocessingGroup" xmlns:w14="http://schemas.microsoft.com/office/word/2010/wordml" xmlns:w15="http://schemas.microsoft.com/office/word/2012/wordml" xmlns:w16="http://schemas.microsoft.com/office/word/2018/wordml" xmlns:w16cex="http://schemas.microsoft.com/office/word/2018/wordml/cex" xmlns:w16cid="http://schemas.microsoft.com/office/word/2016/wordml/cid" xmlns="http://schemas.microsoft.com/office/tasks/2019/documenttasks" xmlns:cr="http://schemas.microsoft.com/office/comments/2020/reactions">
+  <w:p>
+    <w:pPr>
+      <w:rPr/>
+    </w:pPr>
+    <w:r>
+      <w:rPr>
+        <w:rtl w:val="0"/>
+      </w:rPr>
+    </w:r>
+  </w:p>
+</w:hdr>
 </file>
 
 <file path=word/numbering.xml><?xml version="1.0" encoding="utf-8"?>

</xml_diff>